<commit_message>
feat: randomize paired roles and audit experiment flow
</commit_message>
<xml_diff>
--- a/00_start_materials/第三四次开会/第3 4 次开会会议记录.docx
+++ b/00_start_materials/第三四次开会/第3 4 次开会会议记录.docx
@@ -75,164 +75,236 @@
         <w:rPr>
           <w:rFonts w:hint="eastAsia"/>
         </w:rPr>
+        <w:t>——</w:t>
+      </w:r>
+      <w:proofErr w:type="gramStart"/>
+      <w:r>
+        <w:rPr>
+          <w:rFonts w:hint="eastAsia"/>
+        </w:rPr>
+        <w:t>——</w:t>
+      </w:r>
+      <w:proofErr w:type="gramEnd"/>
+    </w:p>
+    <w:p>
+      <w:pPr>
+        <w:rPr>
+          <w:rFonts w:hint="eastAsia"/>
+        </w:rPr>
+      </w:pPr>
+      <w:r>
+        <w:rPr>
+          <w:rFonts w:hint="eastAsia"/>
+        </w:rPr>
+        <w:t>重构与精修了很多：</w:t>
+      </w:r>
+    </w:p>
+    <w:p>
+      <w:pPr>
+        <w:rPr>
+          <w:rFonts w:hint="eastAsia"/>
+        </w:rPr>
+      </w:pPr>
+      <w:r>
+        <w:rPr>
+          <w:rFonts w:hint="eastAsia"/>
+        </w:rPr>
+        <w:t>（1）被试分配逻辑和正式流程分段已重新梳理；</w:t>
+      </w:r>
+    </w:p>
+    <w:p>
+      <w:pPr>
+        <w:rPr>
+          <w:rFonts w:hint="eastAsia"/>
+        </w:rPr>
+      </w:pPr>
+      <w:r>
+        <w:rPr>
+          <w:rFonts w:hint="eastAsia"/>
+        </w:rPr>
+        <w:t>（2）实验主流程已改为 A/B 同步作答，前端状态同步机制也从轮询切换为 SSE；</w:t>
+      </w:r>
+    </w:p>
+    <w:p>
+      <w:pPr>
+        <w:rPr>
+          <w:rFonts w:hint="eastAsia"/>
+        </w:rPr>
+      </w:pPr>
+      <w:r>
+        <w:rPr>
+          <w:rFonts w:hint="eastAsia"/>
+        </w:rPr>
+        <w:t>（3）副线任务部分完成了整套 UI 重做，包括副线任务页改版，以及顶部提示从右向左滚动的更优雅实现。</w:t>
+      </w:r>
+    </w:p>
+    <w:p>
+      <w:pPr>
+        <w:rPr>
+          <w:rFonts w:hint="eastAsia"/>
+        </w:rPr>
+      </w:pPr>
+      <w:r>
+        <w:rPr>
+          <w:rFonts w:hint="eastAsia"/>
+        </w:rPr>
+        <w:t>（4）AI 区已支持基础版/高级版双层能力，并在 admin 后台加入了 AI 参数配置模块，可调整基础/高级模型的 baseline URL、API Key 及上下文保留条数。</w:t>
+      </w:r>
+    </w:p>
+    <w:p>
+      <w:pPr>
+        <w:rPr>
+          <w:rFonts w:hint="eastAsia"/>
+        </w:rPr>
+      </w:pPr>
+      <w:r>
+        <w:rPr>
+          <w:rFonts w:hint="eastAsia"/>
+        </w:rPr>
+        <w:t>（5）主界面方面，材料区设计了txt docx excel pdf四种阅读器，很优雅了。</w:t>
+      </w:r>
+    </w:p>
+    <w:p>
+      <w:pPr>
+        <w:rPr>
+          <w:rFonts w:hint="eastAsia"/>
+        </w:rPr>
+      </w:pPr>
+      <w:r>
+        <w:rPr>
+          <w:rFonts w:hint="eastAsia"/>
+        </w:rPr>
+        <w:t>（6）设计了材料系统- 写了admin 文件上</w:t>
+      </w:r>
+      <w:proofErr w:type="gramStart"/>
+      <w:r>
+        <w:rPr>
+          <w:rFonts w:hint="eastAsia"/>
+        </w:rPr>
+        <w:t>传系统</w:t>
+      </w:r>
+      <w:proofErr w:type="gramEnd"/>
+      <w:r>
+        <w:rPr>
+          <w:rFonts w:hint="eastAsia"/>
+        </w:rPr>
+        <w:t>及配套上传手册；</w:t>
+      </w:r>
+    </w:p>
+    <w:p>
+      <w:pPr>
+        <w:rPr>
+          <w:rFonts w:hint="eastAsia"/>
+        </w:rPr>
+      </w:pPr>
+      <w:r>
+        <w:rPr>
+          <w:rFonts w:hint="eastAsia"/>
+        </w:rPr>
+        <w:t>（7）</w:t>
+      </w:r>
+      <w:proofErr w:type="gramStart"/>
+      <w:r>
+        <w:rPr>
+          <w:rFonts w:hint="eastAsia"/>
+        </w:rPr>
+        <w:t>作答区</w:t>
+      </w:r>
+      <w:proofErr w:type="gramEnd"/>
+      <w:r>
+        <w:rPr>
+          <w:rFonts w:hint="eastAsia"/>
+        </w:rPr>
+        <w:t>也已按 师兄给的Word 版本对AB</w:t>
+      </w:r>
+      <w:proofErr w:type="gramStart"/>
+      <w:r>
+        <w:rPr>
+          <w:rFonts w:hint="eastAsia"/>
+        </w:rPr>
+        <w:t>作答区</w:t>
+      </w:r>
+      <w:proofErr w:type="gramEnd"/>
+      <w:r>
+        <w:rPr>
+          <w:rFonts w:hint="eastAsia"/>
+        </w:rPr>
+        <w:t>实现一比一复刻。</w:t>
+      </w:r>
+    </w:p>
+    <w:p>
+      <w:pPr>
+        <w:rPr>
+          <w:rFonts w:hint="eastAsia"/>
+        </w:rPr>
+      </w:pPr>
+      <w:r>
+        <w:rPr>
+          <w:rFonts w:hint="eastAsia"/>
+        </w:rPr>
+        <w:t>（8）数据保存方面，快照功能已落地，（师兄说的5分钟1到B存一个快照）</w:t>
+      </w:r>
+    </w:p>
+    <w:p>
+      <w:pPr>
+        <w:rPr>
+          <w:rFonts w:hint="eastAsia"/>
+        </w:rPr>
+      </w:pPr>
+      <w:r>
+        <w:rPr>
+          <w:rFonts w:hint="eastAsia"/>
+        </w:rPr>
+        <w:t xml:space="preserve">（9）交互能力上，还补齐了截图复制、AI </w:t>
+      </w:r>
+      <w:proofErr w:type="gramStart"/>
+      <w:r>
+        <w:rPr>
+          <w:rFonts w:hint="eastAsia"/>
+        </w:rPr>
+        <w:t>区图片</w:t>
+      </w:r>
+      <w:proofErr w:type="gramEnd"/>
+      <w:r>
+        <w:rPr>
+          <w:rFonts w:hint="eastAsia"/>
+        </w:rPr>
+        <w:t>粘贴、分区域缩放等功能。</w:t>
+      </w:r>
+    </w:p>
+    <w:p>
+      <w:pPr>
+        <w:rPr>
+          <w:rFonts w:hint="eastAsia"/>
+        </w:rPr>
+      </w:pPr>
+      <w:r>
+        <w:rPr>
+          <w:rFonts w:hint="eastAsia"/>
+        </w:rPr>
+        <w:t>（10）服务器和域名部署方案也已初步调研，后续再细化采购与备案流程，整体可以控制在 1000 元以内。</w:t>
+      </w:r>
+    </w:p>
+    <w:p>
+      <w:pPr>
+        <w:rPr>
+          <w:rFonts w:hint="eastAsia"/>
+        </w:rPr>
+      </w:pPr>
+      <w:r>
+        <w:rPr>
+          <w:rFonts w:hint="eastAsia"/>
+        </w:rPr>
+        <w:t>——</w:t>
+      </w:r>
+      <w:proofErr w:type="gramStart"/>
+      <w:r>
+        <w:rPr>
+          <w:rFonts w:hint="eastAsia"/>
+        </w:rPr>
         <w:t>————</w:t>
       </w:r>
-    </w:p>
-    <w:p>
-      <w:pPr>
-        <w:rPr>
-          <w:rFonts w:hint="eastAsia"/>
-        </w:rPr>
-      </w:pPr>
-      <w:r>
-        <w:rPr>
-          <w:rFonts w:hint="eastAsia"/>
-        </w:rPr>
-        <w:t>重构与精修了很多：</w:t>
-      </w:r>
-    </w:p>
-    <w:p>
-      <w:pPr>
-        <w:rPr>
-          <w:rFonts w:hint="eastAsia"/>
-        </w:rPr>
-      </w:pPr>
-      <w:r>
-        <w:rPr>
-          <w:rFonts w:hint="eastAsia"/>
-        </w:rPr>
-        <w:t>（1）被试分配逻辑和正式流程分段已重新梳理；</w:t>
-      </w:r>
-    </w:p>
-    <w:p>
-      <w:pPr>
-        <w:rPr>
-          <w:rFonts w:hint="eastAsia"/>
-        </w:rPr>
-      </w:pPr>
-      <w:r>
-        <w:rPr>
-          <w:rFonts w:hint="eastAsia"/>
-        </w:rPr>
-        <w:t>（2）实验主流程已改为 A/B 同步作答，前端状态同步机制也从轮询切换为 SSE；</w:t>
-      </w:r>
-    </w:p>
-    <w:p>
-      <w:pPr>
-        <w:rPr>
-          <w:rFonts w:hint="eastAsia"/>
-        </w:rPr>
-      </w:pPr>
-      <w:r>
-        <w:rPr>
-          <w:rFonts w:hint="eastAsia"/>
-        </w:rPr>
-        <w:t>（3）副线任务部分完成了整套 UI 重做，包括副线任务页改版，以及顶部提示从右向左滚动的更优雅实现。</w:t>
-      </w:r>
-    </w:p>
-    <w:p>
-      <w:pPr>
-        <w:rPr>
-          <w:rFonts w:hint="eastAsia"/>
-        </w:rPr>
-      </w:pPr>
-      <w:r>
-        <w:rPr>
-          <w:rFonts w:hint="eastAsia"/>
-        </w:rPr>
-        <w:t>（4）AI 区已支持基础版/高级版双层能力，并在 admin 后台加入了 AI 参数配置模块，可调整基础/高级模型的 baseline URL、API Key 及上下文保留条数。</w:t>
-      </w:r>
-    </w:p>
-    <w:p>
-      <w:pPr>
-        <w:rPr>
-          <w:rFonts w:hint="eastAsia"/>
-        </w:rPr>
-      </w:pPr>
-      <w:r>
-        <w:rPr>
-          <w:rFonts w:hint="eastAsia"/>
-        </w:rPr>
-        <w:t>（5）主界面方面，材料区设计了txt docx excel pdf四种阅读器，很优雅了。</w:t>
-      </w:r>
-    </w:p>
-    <w:p>
-      <w:pPr>
-        <w:rPr>
-          <w:rFonts w:hint="eastAsia"/>
-        </w:rPr>
-      </w:pPr>
-      <w:r>
-        <w:rPr>
-          <w:rFonts w:hint="eastAsia"/>
-        </w:rPr>
-        <w:t>（6）设计了材料系统- 写了admin 文件上传系统及配套上传手册；</w:t>
-      </w:r>
-    </w:p>
-    <w:p>
-      <w:pPr>
-        <w:rPr>
-          <w:rFonts w:hint="eastAsia"/>
-        </w:rPr>
-      </w:pPr>
-      <w:r>
-        <w:rPr>
-          <w:rFonts w:hint="eastAsia"/>
-        </w:rPr>
-        <w:t>（7）作答区也已按 师兄给的Word 版本对AB作答区实现一比一复刻。</w:t>
-      </w:r>
-    </w:p>
-    <w:p>
-      <w:pPr>
-        <w:rPr>
-          <w:rFonts w:hint="eastAsia"/>
-        </w:rPr>
-      </w:pPr>
-      <w:r>
-        <w:rPr>
-          <w:rFonts w:hint="eastAsia"/>
-        </w:rPr>
-        <w:t>（8）数据保存方面，快照功能已落地，（师兄说的5分钟1到B存一个快照）</w:t>
-      </w:r>
-    </w:p>
-    <w:p>
-      <w:pPr>
-        <w:rPr>
-          <w:rFonts w:hint="eastAsia"/>
-        </w:rPr>
-      </w:pPr>
-      <w:r>
-        <w:rPr>
-          <w:rFonts w:hint="eastAsia"/>
-        </w:rPr>
-        <w:t>（9）交互能力上，还补齐了截图复制、AI 区图片粘贴、分区域缩放等功能。</w:t>
-      </w:r>
-    </w:p>
-    <w:p>
-      <w:pPr>
-        <w:rPr>
-          <w:rFonts w:hint="eastAsia"/>
-        </w:rPr>
-      </w:pPr>
-      <w:r>
-        <w:rPr>
-          <w:rFonts w:hint="eastAsia"/>
-        </w:rPr>
-        <w:t>（10）服务器和域名部署方案也已初步调研，后续再细化采购与备案流程，整体可以控制在 1000 元以内。</w:t>
-      </w:r>
-    </w:p>
-    <w:p>
-      <w:pPr>
-        <w:rPr>
-          <w:rFonts w:hint="eastAsia"/>
-        </w:rPr>
-      </w:pPr>
-      <w:r>
-        <w:rPr>
-          <w:rFonts w:hint="eastAsia"/>
-        </w:rPr>
-        <w:t>——————</w:t>
-      </w:r>
+      <w:proofErr w:type="gramEnd"/>
     </w:p>
     <w:p>
       <w:pPr>
@@ -359,7 +431,21 @@
         <w:rPr>
           <w:rFonts w:hint="eastAsia"/>
         </w:rPr>
-        <w:t>（7）deepseek不支持多模态-</w:t>
+        <w:t>（7）</w:t>
+      </w:r>
+      <w:proofErr w:type="spellStart"/>
+      <w:r>
+        <w:rPr>
+          <w:rFonts w:hint="eastAsia"/>
+        </w:rPr>
+        <w:t>deepseek</w:t>
+      </w:r>
+      <w:proofErr w:type="spellEnd"/>
+      <w:r>
+        <w:rPr>
+          <w:rFonts w:hint="eastAsia"/>
+        </w:rPr>
+        <w:t>不支持多模态-</w:t>
       </w:r>
       <w:r>
         <w:rPr>
@@ -377,19 +463,49 @@
         <w:rPr>
           <w:rFonts w:hint="eastAsia"/>
         </w:rPr>
-        <w:t>-（多模态+能力差别+国内）千问-</w:t>
-      </w:r>
-      <w:r>
-        <w:rPr>
-          <w:rFonts w:hint="eastAsia"/>
-        </w:rPr>
-        <w:t>基础版：qwen-turbo高级版：qwen3-vl-plus</w:t>
-      </w:r>
-      <w:r>
-        <w:rPr>
-          <w:rFonts w:hint="eastAsia"/>
-        </w:rPr>
-        <w:t>。或者智谱GLM</w:t>
+        <w:t>-（多模态+能力差别+国内）</w:t>
+      </w:r>
+      <w:proofErr w:type="gramStart"/>
+      <w:r>
+        <w:rPr>
+          <w:rFonts w:hint="eastAsia"/>
+        </w:rPr>
+        <w:t>千问</w:t>
+      </w:r>
+      <w:proofErr w:type="gramEnd"/>
+      <w:r>
+        <w:rPr>
+          <w:rFonts w:hint="eastAsia"/>
+        </w:rPr>
+        <w:t>-基础版：</w:t>
+      </w:r>
+      <w:proofErr w:type="spellStart"/>
+      <w:r>
+        <w:rPr>
+          <w:rFonts w:hint="eastAsia"/>
+        </w:rPr>
+        <w:t>qwen</w:t>
+      </w:r>
+      <w:proofErr w:type="spellEnd"/>
+      <w:r>
+        <w:rPr>
+          <w:rFonts w:hint="eastAsia"/>
+        </w:rPr>
+        <w:t>-turbo高级版：qwen3-vl-plus。</w:t>
+      </w:r>
+      <w:proofErr w:type="gramStart"/>
+      <w:r>
+        <w:rPr>
+          <w:rFonts w:hint="eastAsia"/>
+        </w:rPr>
+        <w:t>或者智谱</w:t>
+      </w:r>
+      <w:proofErr w:type="gramEnd"/>
+      <w:r>
+        <w:rPr>
+          <w:rFonts w:hint="eastAsia"/>
+        </w:rPr>
+        <w:t>GLM</w:t>
       </w:r>
       <w:r>
         <w:rPr>
@@ -398,12 +514,114 @@
         <w:t xml:space="preserve"> 豆包</w:t>
       </w:r>
     </w:p>
-    <w:p>
-      <w:pPr>
-        <w:rPr>
-          <w:rFonts w:hint="eastAsia"/>
-        </w:rPr>
-      </w:pPr>
+    <w:p/>
+    <w:p>
+      <w:pPr>
+        <w:rPr>
+          <w:color w:val="FF0000"/>
+        </w:rPr>
+      </w:pPr>
+      <w:r>
+        <w:rPr>
+          <w:rFonts w:hint="eastAsia"/>
+          <w:color w:val="FF0000"/>
+        </w:rPr>
+        <w:t>1.</w:t>
+      </w:r>
+      <w:r>
+        <w:rPr>
+          <w:rFonts w:hint="eastAsia"/>
+          <w:color w:val="FF0000"/>
+        </w:rPr>
+        <w:t>A</w:t>
+      </w:r>
+      <w:r>
+        <w:rPr>
+          <w:rFonts w:hint="eastAsia"/>
+          <w:color w:val="FF0000"/>
+        </w:rPr>
+        <w:t>五分钟之前不可提交</w:t>
+      </w:r>
+    </w:p>
+    <w:p>
+      <w:pPr>
+        <w:rPr>
+          <w:color w:val="FF0000"/>
+        </w:rPr>
+      </w:pPr>
+      <w:r>
+        <w:rPr>
+          <w:rFonts w:hint="eastAsia"/>
+          <w:color w:val="FF0000"/>
+        </w:rPr>
+        <w:t>2.</w:t>
+      </w:r>
+      <w:r>
+        <w:rPr>
+          <w:rFonts w:hint="eastAsia"/>
+          <w:color w:val="FF0000"/>
+        </w:rPr>
+        <w:t>公司</w:t>
+      </w:r>
+      <w:r>
+        <w:rPr>
+          <w:rFonts w:hint="eastAsia"/>
+          <w:color w:val="FF0000"/>
+        </w:rPr>
+        <w:t>分配</w:t>
+      </w:r>
+      <w:r>
+        <w:rPr>
+          <w:rFonts w:hint="eastAsia"/>
+          <w:color w:val="FF0000"/>
+        </w:rPr>
+        <w:t>的逻辑</w:t>
+      </w:r>
+    </w:p>
+    <w:p>
+      <w:pPr>
+        <w:rPr>
+          <w:color w:val="FF0000"/>
+        </w:rPr>
+      </w:pPr>
+      <w:r>
+        <w:rPr>
+          <w:rFonts w:hint="eastAsia"/>
+          <w:color w:val="FF0000"/>
+        </w:rPr>
+        <w:t>3.材料系统-AB是呈现不同材料的</w:t>
+      </w:r>
+    </w:p>
+    <w:p>
+      <w:pPr>
+        <w:rPr>
+          <w:rFonts w:hint="eastAsia"/>
+          <w:color w:val="FF0000"/>
+        </w:rPr>
+      </w:pPr>
+      <w:r>
+        <w:rPr>
+          <w:rFonts w:hint="eastAsia"/>
+          <w:color w:val="FF0000"/>
+        </w:rPr>
+        <w:t>4.实验方法+模型变量+材料</w:t>
+      </w:r>
+      <w:proofErr w:type="gramStart"/>
+      <w:r>
+        <w:rPr>
+          <w:rFonts w:hint="eastAsia"/>
+          <w:color w:val="FF0000"/>
+        </w:rPr>
+        <w:t>库最终</w:t>
+      </w:r>
+      <w:proofErr w:type="gramEnd"/>
+      <w:r>
+        <w:rPr>
+          <w:rFonts w:hint="eastAsia"/>
+          <w:color w:val="FF0000"/>
+        </w:rPr>
+        <w:t>形式（公司+副线任务+休息段问卷）</w:t>
+      </w:r>
     </w:p>
     <w:p>
       <w:pPr>
@@ -436,27 +654,49 @@
         <w:rPr>
           <w:rFonts w:hint="eastAsia"/>
         </w:rPr>
-        <w:t>另外我想到，所有的干预我都不会告诉被试有这样的干预。但是AI升级那一章比较特殊，虽然被试不知道实验中AI会升级，但是如果真到了升级的那个工作段，还是可以提示他AI升级了。</w:t>
-      </w:r>
-    </w:p>
-    <w:p>
-      <w:pPr>
-        <w:rPr>
-          <w:rFonts w:hint="eastAsia"/>
-        </w:rPr>
-      </w:pPr>
-      <w:r>
-        <w:rPr>
-          <w:rFonts w:hint="eastAsia"/>
-        </w:rPr>
-        <w:t>提示的内容可以放在前一个问卷后、工作段前，也可以放在滚动信息流，也可以放在AI升</w:t>
-      </w:r>
-      <w:r>
-        <w:rPr>
-          <w:rFonts w:hint="eastAsia"/>
-        </w:rPr>
         <w:lastRenderedPageBreak/>
-        <w:t>级后与他第一次交互时AI的回答里，这个你拿捏一下</w:t>
+        <w:t>另外我想到，所有的干预我都不会告诉被试有这样的干预。但是AI升级那一</w:t>
+      </w:r>
+      <w:proofErr w:type="gramStart"/>
+      <w:r>
+        <w:rPr>
+          <w:rFonts w:hint="eastAsia"/>
+        </w:rPr>
+        <w:t>章比较</w:t>
+      </w:r>
+      <w:proofErr w:type="gramEnd"/>
+      <w:r>
+        <w:rPr>
+          <w:rFonts w:hint="eastAsia"/>
+        </w:rPr>
+        <w:t>特殊，虽然被试不知道实验中AI会升级，但是如果真到了升级的那个工作段，还是可以提示他AI升级了。</w:t>
+      </w:r>
+    </w:p>
+    <w:p>
+      <w:pPr>
+        <w:rPr>
+          <w:rFonts w:hint="eastAsia"/>
+        </w:rPr>
+      </w:pPr>
+      <w:r>
+        <w:rPr>
+          <w:rFonts w:hint="eastAsia"/>
+        </w:rPr>
+        <w:t>提示的内容可以放在前一个问卷后、工作段前，也可以放在滚动信息流，也可以放在AI升级后与他第一次</w:t>
+      </w:r>
+      <w:proofErr w:type="gramStart"/>
+      <w:r>
+        <w:rPr>
+          <w:rFonts w:hint="eastAsia"/>
+        </w:rPr>
+        <w:t>交互时</w:t>
+      </w:r>
+      <w:proofErr w:type="gramEnd"/>
+      <w:r>
+        <w:rPr>
+          <w:rFonts w:hint="eastAsia"/>
+        </w:rPr>
+        <w:t>AI的回答里，这个你拿捏一下</w:t>
       </w:r>
     </w:p>
     <w:p>
@@ -491,13 +731,6 @@
       </w:pPr>
     </w:p>
     <w:p>
-      <w:pPr>
-        <w:rPr>
-          <w:rFonts w:hint="eastAsia"/>
-          <w:b/>
-          <w:bCs/>
-        </w:rPr>
-      </w:pPr>
       <w:r>
         <w:rPr>
           <w:rFonts w:hint="eastAsia"/>
@@ -523,6 +756,20 @@
           <w:rFonts w:hint="eastAsia"/>
         </w:rPr>
         <w:t>。目前是看过才能提交</w:t>
+      </w:r>
+    </w:p>
+    <w:p>
+      <w:pPr>
+        <w:rPr>
+          <w:color w:val="FF0000"/>
+        </w:rPr>
+      </w:pPr>
+      <w:r>
+        <w:rPr>
+          <w:rFonts w:hint="eastAsia"/>
+          <w:color w:val="FF0000"/>
+        </w:rPr>
+        <w:t>不看也能提交-但是需要中间态-点击查看</w:t>
       </w:r>
     </w:p>
     <w:p>
@@ -740,7 +987,49 @@
         <w:rPr>
           <w:rFonts w:hint="eastAsia"/>
         </w:rPr>
-        <w:t>被试不再预设 A/B，管理员只上传合格名单，系统按进入顺序自动分配奇数位 A、偶数位 B 并相邻配对。在admin界面需要做出调整-在这里也请你检查admin与原来的inspector界面的逻辑是不是admin接到了原来的inspector界面，不会有bug吧</w:t>
+        <w:t>被试不再预设 A/B，管理员只上传合格名单，系统</w:t>
+      </w:r>
+      <w:proofErr w:type="gramStart"/>
+      <w:r>
+        <w:rPr>
+          <w:rFonts w:hint="eastAsia"/>
+        </w:rPr>
+        <w:t>按进入</w:t>
+      </w:r>
+      <w:proofErr w:type="gramEnd"/>
+      <w:r>
+        <w:rPr>
+          <w:rFonts w:hint="eastAsia"/>
+        </w:rPr>
+        <w:t>顺序自动分配</w:t>
+      </w:r>
+      <w:proofErr w:type="gramStart"/>
+      <w:r>
+        <w:rPr>
+          <w:rFonts w:hint="eastAsia"/>
+        </w:rPr>
+        <w:t>奇数位</w:t>
+      </w:r>
+      <w:proofErr w:type="gramEnd"/>
+      <w:r>
+        <w:rPr>
+          <w:rFonts w:hint="eastAsia"/>
+        </w:rPr>
+        <w:t xml:space="preserve"> A、</w:t>
+      </w:r>
+      <w:proofErr w:type="gramStart"/>
+      <w:r>
+        <w:rPr>
+          <w:rFonts w:hint="eastAsia"/>
+        </w:rPr>
+        <w:t>偶数位</w:t>
+      </w:r>
+      <w:proofErr w:type="gramEnd"/>
+      <w:r>
+        <w:rPr>
+          <w:rFonts w:hint="eastAsia"/>
+        </w:rPr>
+        <w:t xml:space="preserve"> B 并相邻配对。在admin界面需要做出调整-在这里也请你检查admin与原来的inspector界面的逻辑是不是admin接到了原来的inspector界面，不会有bug吧</w:t>
       </w:r>
     </w:p>
     <w:p>
@@ -770,13 +1059,34 @@
         <w:rPr>
           <w:rFonts w:hint="eastAsia"/>
         </w:rPr>
-        <w:t>正式实验改为 3 个工作段 + 2 个休息问卷段，默认 20 分钟工作、5 分钟休息，</w:t>
-      </w:r>
-      <w:r>
-        <w:rPr>
-          <w:rFonts w:hint="eastAsia"/>
-        </w:rPr>
-        <w:t>这个倒计时也要加到目前的UI里面，在目前最上方的条中【AI 投资决策平台】【角色】【当前项目】后面加上一个倒计时</w:t>
+        <w:t xml:space="preserve">正式实验改为 3 </w:t>
+      </w:r>
+      <w:proofErr w:type="gramStart"/>
+      <w:r>
+        <w:rPr>
+          <w:rFonts w:hint="eastAsia"/>
+        </w:rPr>
+        <w:t>个</w:t>
+      </w:r>
+      <w:proofErr w:type="gramEnd"/>
+      <w:r>
+        <w:rPr>
+          <w:rFonts w:hint="eastAsia"/>
+        </w:rPr>
+        <w:t>工作段 + 2 个休息问卷段，默认 20 分钟工作、5 分钟休息，</w:t>
+      </w:r>
+      <w:r>
+        <w:rPr>
+          <w:rFonts w:hint="eastAsia"/>
+        </w:rPr>
+        <w:t>这个倒计</w:t>
+      </w:r>
+      <w:r>
+        <w:rPr>
+          <w:rFonts w:hint="eastAsia"/>
+        </w:rPr>
+        <w:lastRenderedPageBreak/>
+        <w:t>时也要加到目前的UI里面，在目前最上方的条中【AI 投资决策平台】【角色】【当前项目】后面加上一个倒计时</w:t>
       </w:r>
     </w:p>
     <w:p>
@@ -802,14 +1112,7 @@
         <w:rPr>
           <w:rFonts w:hint="eastAsia"/>
         </w:rPr>
-        <w:t>同时-分段之间信息的衔接——工作段主线任务是冻结进度然后恢复之后接着进行的，所以</w:t>
-      </w:r>
-      <w:r>
-        <w:rPr>
-          <w:rFonts w:hint="eastAsia"/>
-        </w:rPr>
-        <w:lastRenderedPageBreak/>
-        <w:t>这里应该是</w:t>
+        <w:t>同时-分段之间信息的衔接——工作段主线任务是冻结进度然后恢复之后接着进行的，所以这里应该是</w:t>
       </w:r>
       <w:r>
         <w:rPr>
@@ -821,7 +1124,21 @@
         <w:rPr>
           <w:rFonts w:hint="eastAsia"/>
         </w:rPr>
-        <w:t>（材料区 作答区与ai区）</w:t>
+        <w:t xml:space="preserve">（材料区 </w:t>
+      </w:r>
+      <w:proofErr w:type="gramStart"/>
+      <w:r>
+        <w:rPr>
+          <w:rFonts w:hint="eastAsia"/>
+        </w:rPr>
+        <w:t>作答区</w:t>
+      </w:r>
+      <w:proofErr w:type="gramEnd"/>
+      <w:r>
+        <w:rPr>
+          <w:rFonts w:hint="eastAsia"/>
+        </w:rPr>
+        <w:t>与ai区）</w:t>
       </w:r>
       <w:r>
         <w:rPr>
@@ -1064,13 +1381,41 @@
         <w:rPr>
           <w:rFonts w:hint="eastAsia"/>
         </w:rPr>
-        <w:t>也就是左侧是材料区放置副线任务区的材料；右侧区域的上半是答题区-也就是目前的三个选项</w:t>
-      </w:r>
-      <w:r>
-        <w:rPr>
-          <w:rFonts w:hint="eastAsia"/>
-        </w:rPr>
-        <w:t>；右区域的下半我们要加上副线任务区的AI聊天</w:t>
+        <w:t>也就是左侧是材料区放置副线任务区的材料；右侧区域的上半是</w:t>
+      </w:r>
+      <w:proofErr w:type="gramStart"/>
+      <w:r>
+        <w:rPr>
+          <w:rFonts w:hint="eastAsia"/>
+        </w:rPr>
+        <w:t>答题区</w:t>
+      </w:r>
+      <w:proofErr w:type="gramEnd"/>
+      <w:r>
+        <w:rPr>
+          <w:rFonts w:hint="eastAsia"/>
+        </w:rPr>
+        <w:t>-也就是目前的三个选项</w:t>
+      </w:r>
+      <w:r>
+        <w:rPr>
+          <w:rFonts w:hint="eastAsia"/>
+        </w:rPr>
+        <w:t>；</w:t>
+      </w:r>
+      <w:proofErr w:type="gramStart"/>
+      <w:r>
+        <w:rPr>
+          <w:rFonts w:hint="eastAsia"/>
+        </w:rPr>
+        <w:t>右区域</w:t>
+      </w:r>
+      <w:proofErr w:type="gramEnd"/>
+      <w:r>
+        <w:rPr>
+          <w:rFonts w:hint="eastAsia"/>
+        </w:rPr>
+        <w:t>的下半我们要加上副线任务区的AI聊天</w:t>
       </w:r>
     </w:p>
     <w:p>
@@ -1096,7 +1441,21 @@
         <w:rPr>
           <w:rFonts w:hint="eastAsia"/>
         </w:rPr>
-        <w:t>在作答的时候，切换下一题的UX是在右上作答区选择答案之后上一题-下一题点击下一题</w:t>
+        <w:t>在作答的时候，切换下一题的UX是在右上</w:t>
+      </w:r>
+      <w:proofErr w:type="gramStart"/>
+      <w:r>
+        <w:rPr>
+          <w:rFonts w:hint="eastAsia"/>
+        </w:rPr>
+        <w:t>作答区</w:t>
+      </w:r>
+      <w:proofErr w:type="gramEnd"/>
+      <w:r>
+        <w:rPr>
+          <w:rFonts w:hint="eastAsia"/>
+        </w:rPr>
+        <w:t>选择答案之后上一题-下一题点击下一题</w:t>
       </w:r>
     </w:p>
     <w:p>
@@ -1149,20 +1508,48 @@
         <w:rPr>
           <w:rFonts w:hint="eastAsia"/>
         </w:rPr>
-        <w:t>B不再有等待区页面-这个去掉了！在各个md中改一下，该删的删</w:t>
-      </w:r>
-    </w:p>
-    <w:p>
-      <w:pPr>
-        <w:rPr>
-          <w:rFonts w:hint="eastAsia"/>
-        </w:rPr>
-      </w:pPr>
-      <w:r>
-        <w:rPr>
-          <w:rFonts w:hint="eastAsia"/>
-        </w:rPr>
-        <w:t>因为考虑到A做任务需要得5分钟但是B等5分钟一个工作段才20min这样B就做不了几个了</w:t>
+        <w:t>B不再有等待区页面-这个去掉了！在各个md中改一下，该</w:t>
+      </w:r>
+      <w:proofErr w:type="gramStart"/>
+      <w:r>
+        <w:rPr>
+          <w:rFonts w:hint="eastAsia"/>
+        </w:rPr>
+        <w:t>删</w:t>
+      </w:r>
+      <w:proofErr w:type="gramEnd"/>
+      <w:r>
+        <w:rPr>
+          <w:rFonts w:hint="eastAsia"/>
+        </w:rPr>
+        <w:t>的删</w:t>
+      </w:r>
+    </w:p>
+    <w:p>
+      <w:pPr>
+        <w:rPr>
+          <w:rFonts w:hint="eastAsia"/>
+        </w:rPr>
+      </w:pPr>
+      <w:r>
+        <w:rPr>
+          <w:rFonts w:hint="eastAsia"/>
+        </w:rPr>
+        <w:t>因为考虑到A</w:t>
+      </w:r>
+      <w:proofErr w:type="gramStart"/>
+      <w:r>
+        <w:rPr>
+          <w:rFonts w:hint="eastAsia"/>
+        </w:rPr>
+        <w:t>做任务</w:t>
+      </w:r>
+      <w:proofErr w:type="gramEnd"/>
+      <w:r>
+        <w:rPr>
+          <w:rFonts w:hint="eastAsia"/>
+        </w:rPr>
+        <w:t>需要得5分钟但是B等5分钟一个工作段才20min这样B就做不了几个了</w:t>
       </w:r>
     </w:p>
     <w:p>
@@ -1189,7 +1576,21 @@
         <w:rPr>
           <w:rFonts w:hint="eastAsia"/>
         </w:rPr>
-        <w:t>首先分配公司的逻辑变了！现在是公司库全随机分配就好了没有什么</w:t>
+        <w:t>首先分配公司的逻辑变了！现在是公</w:t>
+      </w:r>
+      <w:proofErr w:type="gramStart"/>
+      <w:r>
+        <w:rPr>
+          <w:rFonts w:hint="eastAsia"/>
+        </w:rPr>
+        <w:t>司库全</w:t>
+      </w:r>
+      <w:proofErr w:type="gramEnd"/>
+      <w:r>
+        <w:rPr>
+          <w:rFonts w:hint="eastAsia"/>
+        </w:rPr>
+        <w:t>随机分配就好了没有什么</w:t>
       </w:r>
       <w:r>
         <w:rPr>
@@ -1226,7 +1627,21 @@
         <w:rPr>
           <w:rFonts w:hint="eastAsia"/>
         </w:rPr>
-        <w:t>强制保存并把答题区该提交给B的提交</w:t>
+        <w:t>强制保存并把</w:t>
+      </w:r>
+      <w:proofErr w:type="gramStart"/>
+      <w:r>
+        <w:rPr>
+          <w:rFonts w:hint="eastAsia"/>
+        </w:rPr>
+        <w:t>答题区</w:t>
+      </w:r>
+      <w:proofErr w:type="gramEnd"/>
+      <w:r>
+        <w:rPr>
+          <w:rFonts w:hint="eastAsia"/>
+        </w:rPr>
+        <w:t>该提交给B的提交</w:t>
       </w:r>
       <w:r>
         <w:rPr>
@@ -1386,7 +1801,35 @@
         <w:rPr>
           <w:rFonts w:hint="eastAsia"/>
         </w:rPr>
-        <w:t>，也就是作答区ai区都存一下目前进度后面可能需要分析，保存的时候名字要是写上5分钟快照与时间戳</w:t>
+        <w:t>，也就是</w:t>
+      </w:r>
+      <w:proofErr w:type="gramStart"/>
+      <w:r>
+        <w:rPr>
+          <w:rFonts w:hint="eastAsia"/>
+        </w:rPr>
+        <w:t>作答区</w:t>
+      </w:r>
+      <w:proofErr w:type="gramEnd"/>
+      <w:r>
+        <w:rPr>
+          <w:rFonts w:hint="eastAsia"/>
+        </w:rPr>
+        <w:t>ai区都</w:t>
+      </w:r>
+      <w:proofErr w:type="gramStart"/>
+      <w:r>
+        <w:rPr>
+          <w:rFonts w:hint="eastAsia"/>
+        </w:rPr>
+        <w:t>存一下</w:t>
+      </w:r>
+      <w:proofErr w:type="gramEnd"/>
+      <w:r>
+        <w:rPr>
+          <w:rFonts w:hint="eastAsia"/>
+        </w:rPr>
+        <w:t>目前进度后面可能需要分析，保存的时候名字要是写上5分钟快照与时间戳</w:t>
       </w:r>
     </w:p>
     <w:p>
@@ -1424,7 +1867,35 @@
         <w:rPr>
           <w:rFonts w:hint="eastAsia"/>
         </w:rPr>
-        <w:t>目前登陆-配对-指导语-正式试验，在正式实验之前添加一个测试轮主要告诉被试在干什么，具体教学怎么办我们后面再改，但是这里需要专门加个page是测试轮，目前先完全复制主页面</w:t>
+        <w:t>目前登陆-配对-指导语-正式试验，在正式实验之前添加一个测试</w:t>
+      </w:r>
+      <w:proofErr w:type="gramStart"/>
+      <w:r>
+        <w:rPr>
+          <w:rFonts w:hint="eastAsia"/>
+        </w:rPr>
+        <w:t>轮主要</w:t>
+      </w:r>
+      <w:proofErr w:type="gramEnd"/>
+      <w:r>
+        <w:rPr>
+          <w:rFonts w:hint="eastAsia"/>
+        </w:rPr>
+        <w:t>告诉被试在干什么，具体教学怎么办我们后面再改，但是这里需要专门加个page是测试轮，目前</w:t>
+      </w:r>
+      <w:proofErr w:type="gramStart"/>
+      <w:r>
+        <w:rPr>
+          <w:rFonts w:hint="eastAsia"/>
+        </w:rPr>
+        <w:t>先完全</w:t>
+      </w:r>
+      <w:proofErr w:type="gramEnd"/>
+      <w:r>
+        <w:rPr>
+          <w:rFonts w:hint="eastAsia"/>
+        </w:rPr>
+        <w:t>复制主页面</w:t>
       </w:r>
       <w:r>
         <w:rPr>
@@ -1436,7 +1907,14 @@
         <w:rPr>
           <w:rFonts w:hint="eastAsia"/>
         </w:rPr>
-        <w:t>。我们先和正式轮一样，后面再改，主要是看看被试</w:t>
+        <w:t>。我们先和正式轮一样，后面再改，主要是看</w:t>
+      </w:r>
+      <w:r>
+        <w:rPr>
+          <w:rFonts w:hint="eastAsia"/>
+        </w:rPr>
+        <w:lastRenderedPageBreak/>
+        <w:t>看被试</w:t>
       </w:r>
       <w:r>
         <w:rPr>
@@ -1525,21 +2003,48 @@
         <w:rPr>
           <w:rFonts w:hint="eastAsia"/>
         </w:rPr>
-        <w:lastRenderedPageBreak/>
-        <w:t>无论A还是B切换公司之后，主界面的AI区的上下文应该是清空的，不应保留context（但是我们的数据库都要记录哈，记录这个ai的context是哪个公司第几个做的这样子，元数据都要记录）；但是副线任务区的AIcontext每个被试是只有一个的，切换公司不影响，因为切换公司又不影响副线任务区的推进</w:t>
-      </w:r>
-    </w:p>
-    <w:p>
-      <w:pPr>
-        <w:rPr>
-          <w:rFonts w:hint="eastAsia"/>
-        </w:rPr>
-      </w:pPr>
-      <w:r>
-        <w:rPr>
-          <w:rFonts w:hint="eastAsia"/>
-        </w:rPr>
-        <w:t>5.2 AI区的具体调用api。我们在三个工作段之间会用不同的API;</w:t>
+        <w:t>无论A还是B切换公司之后，主界面的AI区的上下文应该是清空的，不应保留context（但是我们的数据库都要记录哈，记录这个ai的context是哪个公司第几个做的这样子，元数据都要记录）；但是副线任务区的</w:t>
+      </w:r>
+      <w:proofErr w:type="spellStart"/>
+      <w:r>
+        <w:rPr>
+          <w:rFonts w:hint="eastAsia"/>
+        </w:rPr>
+        <w:t>AIcontext</w:t>
+      </w:r>
+      <w:proofErr w:type="spellEnd"/>
+      <w:r>
+        <w:rPr>
+          <w:rFonts w:hint="eastAsia"/>
+        </w:rPr>
+        <w:t>每个被试是只有一个的，切换公司不影响，因为切换公司又不影响副线任务区的推进</w:t>
+      </w:r>
+    </w:p>
+    <w:p>
+      <w:pPr>
+        <w:rPr>
+          <w:rFonts w:hint="eastAsia"/>
+        </w:rPr>
+      </w:pPr>
+      <w:r>
+        <w:rPr>
+          <w:rFonts w:hint="eastAsia"/>
+        </w:rPr>
+        <w:t>5.2 AI区的具体调用</w:t>
+      </w:r>
+      <w:proofErr w:type="spellStart"/>
+      <w:r>
+        <w:rPr>
+          <w:rFonts w:hint="eastAsia"/>
+        </w:rPr>
+        <w:t>api</w:t>
+      </w:r>
+      <w:proofErr w:type="spellEnd"/>
+      <w:r>
+        <w:rPr>
+          <w:rFonts w:hint="eastAsia"/>
+        </w:rPr>
+        <w:t>。我们在三个工作段之间会用不同的API;</w:t>
       </w:r>
     </w:p>
     <w:p>
@@ -1578,50 +2083,180 @@
         <w:rPr>
           <w:rFonts w:hint="eastAsia"/>
         </w:rPr>
-        <w:t>（1）api的区别，我们会提供两个api一个基础一个高级</w:t>
-      </w:r>
-      <w:r>
-        <w:rPr>
-          <w:rFonts w:hint="eastAsia"/>
-        </w:rPr>
-        <w:t>。这个我们目前是咋做的存在某个txt吗？目前只有一个deepseek的api我们先暂定基础高级都是deepseek的模型，后续用其他厂和其他apikey我们再调整</w:t>
-      </w:r>
-    </w:p>
-    <w:p>
-      <w:pPr>
-        <w:rPr>
-          <w:rFonts w:hint="eastAsia"/>
-        </w:rPr>
-      </w:pPr>
-      <w:r>
-        <w:rPr>
-          <w:rFonts w:hint="eastAsia"/>
-        </w:rPr>
-        <w:t>（2）基础版不能上传截图（高级版ai能读图）-同时UI上基础班的就没有上传附件那个小按钮了也不支持复制到聊天框上传图片了</w:t>
-      </w:r>
-    </w:p>
-    <w:p>
-      <w:pPr>
-        <w:rPr>
-          <w:rFonts w:hint="eastAsia"/>
-        </w:rPr>
-      </w:pPr>
-    </w:p>
-    <w:p>
-      <w:pPr>
-        <w:rPr>
-          <w:rFonts w:hint="eastAsia"/>
-          <w:b/>
-          <w:bCs/>
-        </w:rPr>
-      </w:pPr>
-      <w:r>
-        <w:rPr>
-          <w:rFonts w:hint="eastAsia"/>
-          <w:b/>
-          <w:bCs/>
-        </w:rPr>
-        <w:t>6.原始材料我这里准备了一版本初步的，我们来尝试一下</w:t>
+        <w:t>（1）</w:t>
+      </w:r>
+      <w:proofErr w:type="spellStart"/>
+      <w:r>
+        <w:rPr>
+          <w:rFonts w:hint="eastAsia"/>
+        </w:rPr>
+        <w:t>api</w:t>
+      </w:r>
+      <w:proofErr w:type="spellEnd"/>
+      <w:r>
+        <w:rPr>
+          <w:rFonts w:hint="eastAsia"/>
+        </w:rPr>
+        <w:t>的区别，我们会提供两个</w:t>
+      </w:r>
+      <w:proofErr w:type="spellStart"/>
+      <w:r>
+        <w:rPr>
+          <w:rFonts w:hint="eastAsia"/>
+        </w:rPr>
+        <w:t>api</w:t>
+      </w:r>
+      <w:proofErr w:type="spellEnd"/>
+      <w:r>
+        <w:rPr>
+          <w:rFonts w:hint="eastAsia"/>
+        </w:rPr>
+        <w:t>一个基础一个高级</w:t>
+      </w:r>
+      <w:r>
+        <w:rPr>
+          <w:rFonts w:hint="eastAsia"/>
+        </w:rPr>
+        <w:t>。这个我们目前</w:t>
+      </w:r>
+      <w:proofErr w:type="gramStart"/>
+      <w:r>
+        <w:rPr>
+          <w:rFonts w:hint="eastAsia"/>
+        </w:rPr>
+        <w:t>是咋做的</w:t>
+      </w:r>
+      <w:proofErr w:type="gramEnd"/>
+      <w:r>
+        <w:rPr>
+          <w:rFonts w:hint="eastAsia"/>
+        </w:rPr>
+        <w:t>存在某个txt吗？目前只有一个</w:t>
+      </w:r>
+      <w:proofErr w:type="spellStart"/>
+      <w:r>
+        <w:rPr>
+          <w:rFonts w:hint="eastAsia"/>
+        </w:rPr>
+        <w:t>deepseek</w:t>
+      </w:r>
+      <w:proofErr w:type="spellEnd"/>
+      <w:r>
+        <w:rPr>
+          <w:rFonts w:hint="eastAsia"/>
+        </w:rPr>
+        <w:t>的</w:t>
+      </w:r>
+      <w:proofErr w:type="spellStart"/>
+      <w:r>
+        <w:rPr>
+          <w:rFonts w:hint="eastAsia"/>
+        </w:rPr>
+        <w:t>api</w:t>
+      </w:r>
+      <w:proofErr w:type="spellEnd"/>
+      <w:r>
+        <w:rPr>
+          <w:rFonts w:hint="eastAsia"/>
+        </w:rPr>
+        <w:t>我们先暂定基础高级都是</w:t>
+      </w:r>
+      <w:proofErr w:type="spellStart"/>
+      <w:r>
+        <w:rPr>
+          <w:rFonts w:hint="eastAsia"/>
+        </w:rPr>
+        <w:t>deepseek</w:t>
+      </w:r>
+      <w:proofErr w:type="spellEnd"/>
+      <w:r>
+        <w:rPr>
+          <w:rFonts w:hint="eastAsia"/>
+        </w:rPr>
+        <w:t>的模型，后续用其他厂和其他</w:t>
+      </w:r>
+      <w:proofErr w:type="spellStart"/>
+      <w:r>
+        <w:rPr>
+          <w:rFonts w:hint="eastAsia"/>
+        </w:rPr>
+        <w:t>apikey</w:t>
+      </w:r>
+      <w:proofErr w:type="spellEnd"/>
+      <w:r>
+        <w:rPr>
+          <w:rFonts w:hint="eastAsia"/>
+        </w:rPr>
+        <w:t>我们再调整</w:t>
+      </w:r>
+    </w:p>
+    <w:p>
+      <w:pPr>
+        <w:rPr>
+          <w:rFonts w:hint="eastAsia"/>
+        </w:rPr>
+      </w:pPr>
+      <w:r>
+        <w:rPr>
+          <w:rFonts w:hint="eastAsia"/>
+        </w:rPr>
+        <w:t>（2）基础版不能上传截图（高级版ai能读图）-同时UI上基础班的就没有上传附件那个小按钮了也不支持复制到聊天框上</w:t>
+      </w:r>
+      <w:proofErr w:type="gramStart"/>
+      <w:r>
+        <w:rPr>
+          <w:rFonts w:hint="eastAsia"/>
+        </w:rPr>
+        <w:t>传图片</w:t>
+      </w:r>
+      <w:proofErr w:type="gramEnd"/>
+      <w:r>
+        <w:rPr>
+          <w:rFonts w:hint="eastAsia"/>
+        </w:rPr>
+        <w:t>了</w:t>
+      </w:r>
+    </w:p>
+    <w:p>
+      <w:pPr>
+        <w:rPr>
+          <w:rFonts w:hint="eastAsia"/>
+        </w:rPr>
+      </w:pPr>
+    </w:p>
+    <w:p>
+      <w:pPr>
+        <w:rPr>
+          <w:rFonts w:hint="eastAsia"/>
+          <w:b/>
+          <w:bCs/>
+        </w:rPr>
+      </w:pPr>
+      <w:r>
+        <w:rPr>
+          <w:rFonts w:hint="eastAsia"/>
+          <w:b/>
+          <w:bCs/>
+        </w:rPr>
+        <w:t>6.原始材料我这里准备了</w:t>
+      </w:r>
+      <w:proofErr w:type="gramStart"/>
+      <w:r>
+        <w:rPr>
+          <w:rFonts w:hint="eastAsia"/>
+          <w:b/>
+          <w:bCs/>
+        </w:rPr>
+        <w:t>一</w:t>
+      </w:r>
+      <w:proofErr w:type="gramEnd"/>
+      <w:r>
+        <w:rPr>
+          <w:rFonts w:hint="eastAsia"/>
+          <w:b/>
+          <w:bCs/>
+        </w:rPr>
+        <w:t>版本初步的，我们来尝试一下</w:t>
       </w:r>
     </w:p>
     <w:p>
@@ -1665,33 +2300,75 @@
         <w:rPr>
           <w:rFonts w:hint="eastAsia"/>
         </w:rPr>
-        <w:t xml:space="preserve"> AB端的作答区的正式规则来了，请见</w:t>
-      </w:r>
-    </w:p>
-    <w:p>
-      <w:pPr>
-        <w:rPr>
-          <w:rFonts w:hint="eastAsia"/>
-        </w:rPr>
-      </w:pPr>
-      <w:r>
-        <w:rPr>
-          <w:rFonts w:hint="eastAsia"/>
-        </w:rPr>
-        <w:t>"E:\Own_program\multi cooperation\00_start_materials\原始材料\A端尽调表_参与者可见版v2.docx"</w:t>
-      </w:r>
-    </w:p>
-    <w:p>
-      <w:pPr>
-        <w:rPr>
-          <w:rFonts w:hint="eastAsia"/>
-        </w:rPr>
-      </w:pPr>
-      <w:r>
-        <w:rPr>
-          <w:rFonts w:hint="eastAsia"/>
-        </w:rPr>
-        <w:t>"E:\Own_program\multi cooperation\00_start_materials\原始材料\B端投资判断表_参与者可见版.docx"</w:t>
+        <w:t xml:space="preserve"> AB端的</w:t>
+      </w:r>
+      <w:proofErr w:type="gramStart"/>
+      <w:r>
+        <w:rPr>
+          <w:rFonts w:hint="eastAsia"/>
+        </w:rPr>
+        <w:t>作答区</w:t>
+      </w:r>
+      <w:proofErr w:type="gramEnd"/>
+      <w:r>
+        <w:rPr>
+          <w:rFonts w:hint="eastAsia"/>
+        </w:rPr>
+        <w:t>的正式规则来了，请见</w:t>
+      </w:r>
+    </w:p>
+    <w:p>
+      <w:pPr>
+        <w:rPr>
+          <w:rFonts w:hint="eastAsia"/>
+        </w:rPr>
+      </w:pPr>
+      <w:r>
+        <w:rPr>
+          <w:rFonts w:hint="eastAsia"/>
+        </w:rPr>
+        <w:t>"E:\Own_program\multi cooperation\00_start_materials\原始材料\A</w:t>
+      </w:r>
+      <w:proofErr w:type="gramStart"/>
+      <w:r>
+        <w:rPr>
+          <w:rFonts w:hint="eastAsia"/>
+        </w:rPr>
+        <w:t>端尽调表</w:t>
+      </w:r>
+      <w:proofErr w:type="gramEnd"/>
+      <w:r>
+        <w:rPr>
+          <w:rFonts w:hint="eastAsia"/>
+        </w:rPr>
+        <w:t>_参与者可见版v2.docx"</w:t>
+      </w:r>
+    </w:p>
+    <w:p>
+      <w:pPr>
+        <w:rPr>
+          <w:rFonts w:hint="eastAsia"/>
+        </w:rPr>
+      </w:pPr>
+      <w:r>
+        <w:rPr>
+          <w:rFonts w:hint="eastAsia"/>
+        </w:rPr>
+        <w:t>"E:\Own_program\multi cooperation\00_start_materials\原始材料\B</w:t>
+      </w:r>
+      <w:proofErr w:type="gramStart"/>
+      <w:r>
+        <w:rPr>
+          <w:rFonts w:hint="eastAsia"/>
+        </w:rPr>
+        <w:t>端投资</w:t>
+      </w:r>
+      <w:proofErr w:type="gramEnd"/>
+      <w:r>
+        <w:rPr>
+          <w:rFonts w:hint="eastAsia"/>
+        </w:rPr>
+        <w:t>判断表_参与者可见版.docx"</w:t>
       </w:r>
     </w:p>
     <w:p>
@@ -1772,7 +2449,35 @@
         <w:rPr>
           <w:rFonts w:hint="eastAsia"/>
         </w:rPr>
-        <w:t>。目前在材料区的题头参考资料右边是全屏这个按钮，我希望在全屏左侧加一个【截图】让被试用电脑or浏览器调用自己的截图功能进行截图并复制到粘贴板，截图完之后就弱UI提示已经复制到粘贴板即可</w:t>
+        <w:t>。目前在材料区的题头参考资料右边是全屏这个按钮，我希望在全屏左侧加一个【截图】让被试用电脑or浏览器调用自己的截</w:t>
+      </w:r>
+      <w:proofErr w:type="gramStart"/>
+      <w:r>
+        <w:rPr>
+          <w:rFonts w:hint="eastAsia"/>
+        </w:rPr>
+        <w:t>图功能</w:t>
+      </w:r>
+      <w:proofErr w:type="gramEnd"/>
+      <w:r>
+        <w:rPr>
+          <w:rFonts w:hint="eastAsia"/>
+        </w:rPr>
+        <w:t>进行截图并复制到粘贴板，</w:t>
+      </w:r>
+      <w:proofErr w:type="gramStart"/>
+      <w:r>
+        <w:rPr>
+          <w:rFonts w:hint="eastAsia"/>
+        </w:rPr>
+        <w:t>截图完之后</w:t>
+      </w:r>
+      <w:proofErr w:type="gramEnd"/>
+      <w:r>
+        <w:rPr>
+          <w:rFonts w:hint="eastAsia"/>
+        </w:rPr>
+        <w:t>就弱UI提示已经复制到粘贴板即可</w:t>
       </w:r>
     </w:p>
     <w:p>
@@ -1839,27 +2544,62 @@
         <w:rPr>
           <w:rFonts w:hint="eastAsia"/>
         </w:rPr>
-        <w:t>在上面所有的代码书写中都注意与数据库进行对接，尽量保存多的元数据给后台方便我们分析数据使用</w:t>
-      </w:r>
-    </w:p>
-    <w:p>
-      <w:pPr>
-        <w:rPr>
-          <w:rFonts w:hint="eastAsia"/>
-        </w:rPr>
-      </w:pPr>
-    </w:p>
-    <w:p>
-      <w:pPr>
-        <w:rPr>
-          <w:rFonts w:hint="eastAsia"/>
-        </w:rPr>
-      </w:pPr>
-      <w:r>
-        <w:rPr>
-          <w:rFonts w:hint="eastAsia"/>
-        </w:rPr>
-        <w:t>把上面的每句话都认真读，转化为todo清单，一条条的落实到md然后一条条的思考如何代码解决</w:t>
+        <w:t>在上面所有的代码书写中都注意与数据库进行对接，尽量保存多的元数据给后台方便我们分</w:t>
+      </w:r>
+      <w:r>
+        <w:rPr>
+          <w:rFonts w:hint="eastAsia"/>
+        </w:rPr>
+        <w:lastRenderedPageBreak/>
+        <w:t>析数据使用</w:t>
+      </w:r>
+    </w:p>
+    <w:p>
+      <w:pPr>
+        <w:rPr>
+          <w:rFonts w:hint="eastAsia"/>
+        </w:rPr>
+      </w:pPr>
+    </w:p>
+    <w:p>
+      <w:pPr>
+        <w:rPr>
+          <w:rFonts w:hint="eastAsia"/>
+        </w:rPr>
+      </w:pPr>
+      <w:r>
+        <w:rPr>
+          <w:rFonts w:hint="eastAsia"/>
+        </w:rPr>
+        <w:t>把上面的每句话都认真读，转化为</w:t>
+      </w:r>
+      <w:proofErr w:type="spellStart"/>
+      <w:r>
+        <w:rPr>
+          <w:rFonts w:hint="eastAsia"/>
+        </w:rPr>
+        <w:t>todo</w:t>
+      </w:r>
+      <w:proofErr w:type="spellEnd"/>
+      <w:r>
+        <w:rPr>
+          <w:rFonts w:hint="eastAsia"/>
+        </w:rPr>
+        <w:t>清单，</w:t>
+      </w:r>
+      <w:proofErr w:type="gramStart"/>
+      <w:r>
+        <w:rPr>
+          <w:rFonts w:hint="eastAsia"/>
+        </w:rPr>
+        <w:t>一</w:t>
+      </w:r>
+      <w:proofErr w:type="gramEnd"/>
+      <w:r>
+        <w:rPr>
+          <w:rFonts w:hint="eastAsia"/>
+        </w:rPr>
+        <w:t>条条的落实到md然后一条条的思考如何代码解决</w:t>
       </w:r>
       <w:r>
         <w:rPr>
@@ -1871,7 +2611,21 @@
         <w:rPr>
           <w:rFonts w:hint="eastAsia"/>
         </w:rPr>
-        <w:t>我觉得内容任务量有点太大了，你有什么建议吗，我们怎么结构化的把这些的md+代码都给解决？我感觉牵扯到面过于广了-前端后端数据库都有</w:t>
+        <w:t>我觉得内容任务</w:t>
+      </w:r>
+      <w:proofErr w:type="gramStart"/>
+      <w:r>
+        <w:rPr>
+          <w:rFonts w:hint="eastAsia"/>
+        </w:rPr>
+        <w:t>量有点</w:t>
+      </w:r>
+      <w:proofErr w:type="gramEnd"/>
+      <w:r>
+        <w:rPr>
+          <w:rFonts w:hint="eastAsia"/>
+        </w:rPr>
+        <w:t>太大了，你有什么建议吗，我们怎么结构化的把这些的md+代码都给解决？我感觉牵扯到面过于广了-前端后端数据库都有</w:t>
       </w:r>
     </w:p>
     <w:p>
@@ -2012,7 +2766,35 @@
         <w:rPr>
           <w:rFonts w:hint="eastAsia"/>
         </w:rPr>
-        <w:t>baseline url +api key+上下文存多少条</w:t>
+        <w:t xml:space="preserve">baseline </w:t>
+      </w:r>
+      <w:proofErr w:type="spellStart"/>
+      <w:r>
+        <w:rPr>
+          <w:rFonts w:hint="eastAsia"/>
+        </w:rPr>
+        <w:t>url</w:t>
+      </w:r>
+      <w:proofErr w:type="spellEnd"/>
+      <w:r>
+        <w:rPr>
+          <w:rFonts w:hint="eastAsia"/>
+        </w:rPr>
+        <w:t xml:space="preserve"> +</w:t>
+      </w:r>
+      <w:proofErr w:type="spellStart"/>
+      <w:r>
+        <w:rPr>
+          <w:rFonts w:hint="eastAsia"/>
+        </w:rPr>
+        <w:t>api</w:t>
+      </w:r>
+      <w:proofErr w:type="spellEnd"/>
+      <w:r>
+        <w:rPr>
+          <w:rFonts w:hint="eastAsia"/>
+        </w:rPr>
+        <w:t xml:space="preserve"> key+上下文存多少条</w:t>
       </w:r>
     </w:p>
     <w:p>
@@ -2043,7 +2825,21 @@
         <w:rPr>
           <w:rFonts w:hint="eastAsia"/>
         </w:rPr>
-        <w:t>；作答区一比一实现</w:t>
+        <w:t>；</w:t>
+      </w:r>
+      <w:proofErr w:type="gramStart"/>
+      <w:r>
+        <w:rPr>
+          <w:rFonts w:hint="eastAsia"/>
+        </w:rPr>
+        <w:t>作答区</w:t>
+      </w:r>
+      <w:proofErr w:type="gramEnd"/>
+      <w:r>
+        <w:rPr>
+          <w:rFonts w:hint="eastAsia"/>
+        </w:rPr>
+        <w:t>一比一实现</w:t>
       </w:r>
     </w:p>
     <w:p>
@@ -2068,8 +2864,16 @@
         <w:rPr>
           <w:rFonts w:hint="eastAsia"/>
         </w:rPr>
-        <w:t>只有 A 到点自动提交时会写这条 b_five_minute_snapshot</w:t>
-      </w:r>
+        <w:t xml:space="preserve">只有 A 到点自动提交时会写这条 </w:t>
+      </w:r>
+      <w:proofErr w:type="spellStart"/>
+      <w:r>
+        <w:rPr>
+          <w:rFonts w:hint="eastAsia"/>
+        </w:rPr>
+        <w:t>b_five_minute_snapshot</w:t>
+      </w:r>
+      <w:proofErr w:type="spellEnd"/>
       <w:r>
         <w:rPr>
           <w:rFonts w:hint="eastAsia"/>
@@ -2093,8 +2897,16 @@
         <w:rPr>
           <w:rFonts w:hint="eastAsia"/>
         </w:rPr>
-        <w:t>截图功能</w:t>
-      </w:r>
+        <w:t>截</w:t>
+      </w:r>
+      <w:proofErr w:type="gramStart"/>
+      <w:r>
+        <w:rPr>
+          <w:rFonts w:hint="eastAsia"/>
+        </w:rPr>
+        <w:t>图功能</w:t>
+      </w:r>
+      <w:proofErr w:type="gramEnd"/>
       <w:r>
         <w:rPr>
           <w:rFonts w:hint="eastAsia"/>
@@ -2200,7 +3012,23 @@
           <w:rFonts w:hint="eastAsia"/>
           <w:strike/>
         </w:rPr>
-        <w:t>A端信息暂时不解锁的这个逻辑做错了</w:t>
+        <w:t>A</w:t>
+      </w:r>
+      <w:proofErr w:type="gramStart"/>
+      <w:r>
+        <w:rPr>
+          <w:rFonts w:hint="eastAsia"/>
+          <w:strike/>
+        </w:rPr>
+        <w:t>端信息</w:t>
+      </w:r>
+      <w:proofErr w:type="gramEnd"/>
+      <w:r>
+        <w:rPr>
+          <w:rFonts w:hint="eastAsia"/>
+          <w:strike/>
+        </w:rPr>
+        <w:t>暂时不解锁的这个逻辑做错了</w:t>
       </w:r>
     </w:p>
     <w:p>
@@ -2254,7 +3082,23 @@
           <w:rFonts w:hint="eastAsia"/>
           <w:strike/>
         </w:rPr>
-        <w:t>-材料区；作答区看新文件</w:t>
+        <w:t>-材料区；</w:t>
+      </w:r>
+      <w:proofErr w:type="gramStart"/>
+      <w:r>
+        <w:rPr>
+          <w:rFonts w:hint="eastAsia"/>
+          <w:strike/>
+        </w:rPr>
+        <w:t>作答区</w:t>
+      </w:r>
+      <w:proofErr w:type="gramEnd"/>
+      <w:r>
+        <w:rPr>
+          <w:rFonts w:hint="eastAsia"/>
+          <w:strike/>
+        </w:rPr>
+        <w:t>看新文件</w:t>
       </w:r>
     </w:p>
     <w:p>

</xml_diff>